<commit_message>
feat(letterhead): add native text styled footer with active hyperlinks matching design
</commit_message>
<xml_diff>
--- a/TechMindDevelopers_Official_Letterhead_Updated.docx
+++ b/TechMindDevelopers_Official_Letterhead_Updated.docx
@@ -99,173 +99,324 @@
 
 <file path=word/footer2.xml><?xml version="1.0" encoding="utf-8"?>
 <w:ftr xmlns:wpc="http://schemas.microsoft.com/office/word/2010/wordprocessingCanvas" xmlns:cx="http://schemas.microsoft.com/office/drawing/2014/chartex" xmlns:cx1="http://schemas.microsoft.com/office/drawing/2015/9/8/chartex" xmlns:cx2="http://schemas.microsoft.com/office/drawing/2015/10/21/chartex" xmlns:cx3="http://schemas.microsoft.com/office/drawing/2016/5/9/chartex" xmlns:cx4="http://schemas.microsoft.com/office/drawing/2016/5/10/chartex" xmlns:cx5="http://schemas.microsoft.com/office/drawing/2016/5/11/chartex" xmlns:cx6="http://schemas.microsoft.com/office/drawing/2016/5/12/chartex" xmlns:cx7="http://schemas.microsoft.com/office/drawing/2016/5/13/chartex" xmlns:cx8="http://schemas.microsoft.com/office/drawing/2016/5/14/chartex" xmlns:mc="http://schemas.openxmlformats.org/markup-compatibility/2006" xmlns:aink="http://schemas.microsoft.com/office/drawing/2016/ink" xmlns:am3d="http://schemas.microsoft.com/office/drawing/2017/model3d" xmlns:o="urn:schemas-microsoft-com:office:office" xmlns:oel="http://schemas.microsoft.com/office/2019/extlst" xmlns:r="http://schemas.openxmlformats.org/officeDocument/2006/relationships" xmlns:m="http://schemas.openxmlformats.org/officeDocument/2006/math" xmlns:v="urn:schemas-microsoft-com:vml" xmlns:wp14="http://schemas.microsoft.com/office/word/2010/wordprocessingDrawing" xmlns:wp="http://schemas.openxmlformats.org/drawingml/2006/wordprocessingDrawing" xmlns:w10="urn:schemas-microsoft-com:office:word" xmlns:w="http://schemas.openxmlformats.org/wordprocessingml/2006/main" xmlns:w14="http://schemas.microsoft.com/office/word/2010/wordml" xmlns:w15="http://schemas.microsoft.com/office/word/2012/wordml" xmlns:w16cex="http://schemas.microsoft.com/office/word/2018/wordml/cex" xmlns:w16cid="http://schemas.microsoft.com/office/word/2016/wordml/cid" xmlns:w16="http://schemas.microsoft.com/office/word/2018/wordml" xmlns:w16du="http://schemas.microsoft.com/office/word/2023/wordml/word16du" xmlns:w16sdtdh="http://schemas.microsoft.com/office/word/2020/wordml/sdtdatahash" xmlns:w16se="http://schemas.microsoft.com/office/word/2015/wordml/symex" xmlns:wpg="http://schemas.microsoft.com/office/word/2010/wordprocessingGroup" xmlns:wpi="http://schemas.microsoft.com/office/word/2010/wordprocessingInk" xmlns:wne="http://schemas.microsoft.com/office/word/2006/wordml" xmlns:wps="http://schemas.microsoft.com/office/word/2010/wordprocessingShape" mc:Ignorable="w14 w15 w16se w16cid w16 w16cex w16sdtdh w16du wp14">
+  <w:tbl>
+    <w:tblPr>
+      <w:tblW w:type="auto" w:w="0"/>
+      <w:tblLook w:firstColumn="1" w:firstRow="1" w:lastColumn="0" w:lastRow="0" w:noHBand="0" w:noVBand="1" w:val="04A0"/>
+      <w:tblBorders>
+        <w:top w:val="none"/>
+        <w:left w:val="none"/>
+        <w:bottom w:val="none"/>
+        <w:right w:val="none"/>
+        <w:insideH w:val="none"/>
+        <w:insideV w:val="none"/>
+      </w:tblBorders>
+    </w:tblPr>
+    <w:tblGrid>
+      <w:gridCol w:w="1603"/>
+      <w:gridCol w:w="1603"/>
+      <w:gridCol w:w="1603"/>
+      <w:gridCol w:w="1603"/>
+      <w:gridCol w:w="1603"/>
+      <w:gridCol w:w="1603"/>
+    </w:tblGrid>
+    <w:tr>
+      <w:tc>
+        <w:tcPr>
+          <w:tcW w:type="dxa" w:w="403"/>
+          <w:vAlign w:val="center"/>
+          <w:tcMar>
+            <w:left w:w="0" w:type="dxa"/>
+            <w:right w:w="40" w:type="dxa"/>
+            <w:top w:w="0" w:type="dxa"/>
+            <w:bottom w:w="0" w:type="dxa"/>
+          </w:tcMar>
+        </w:tcPr>
+        <w:p>
+          <w:pPr>
+            <w:spacing w:before="0" w:after="0" w:line="240" w:lineRule="auto"/>
+          </w:pPr>
+          <w:r>
+            <w:drawing>
+              <wp:inline xmlns:a="http://schemas.openxmlformats.org/drawingml/2006/main" xmlns:pic="http://schemas.openxmlformats.org/drawingml/2006/picture">
+                <wp:extent cx="219456" cy="219456"/>
+                <wp:docPr id="1" name="Picture 1"/>
+                <wp:cNvGraphicFramePr>
+                  <a:graphicFrameLocks noChangeAspect="1"/>
+                </wp:cNvGraphicFramePr>
+                <a:graphic>
+                  <a:graphicData uri="http://schemas.openxmlformats.org/drawingml/2006/picture">
+                    <pic:pic>
+                      <pic:nvPicPr>
+                        <pic:cNvPr id="0" name="crisp_phone.png"/>
+                        <pic:cNvPicPr/>
+                      </pic:nvPicPr>
+                      <pic:blipFill>
+                        <a:blip r:embed="rId1"/>
+                        <a:stretch>
+                          <a:fillRect/>
+                        </a:stretch>
+                      </pic:blipFill>
+                      <pic:spPr>
+                        <a:xfrm>
+                          <a:off x="0" y="0"/>
+                          <a:ext cx="219456" cy="219456"/>
+                        </a:xfrm>
+                        <a:prstGeom prst="rect"/>
+                      </pic:spPr>
+                    </pic:pic>
+                  </a:graphicData>
+                </a:graphic>
+              </wp:inline>
+            </w:drawing>
+          </w:r>
+        </w:p>
+      </w:tc>
+      <w:tc>
+        <w:tcPr>
+          <w:tcW w:type="dxa" w:w="2477"/>
+          <w:vAlign w:val="center"/>
+          <w:tcMar>
+            <w:left w:w="40" w:type="dxa"/>
+            <w:right w:w="60" w:type="dxa"/>
+            <w:top w:w="0" w:type="dxa"/>
+            <w:bottom w:w="0" w:type="dxa"/>
+          </w:tcMar>
+        </w:tcPr>
+        <w:p>
+          <w:pPr>
+            <w:spacing w:before="0" w:after="30" w:line="240" w:lineRule="auto"/>
+          </w:pPr>
+          <w:r>
+            <w:rPr>
+              <w:rFonts w:ascii="Segoe UI" w:hAnsi="Segoe UI"/>
+              <w:color w:val="64748B"/>
+              <w:sz w:val="15"/>
+            </w:rPr>
+            <w:t>Phone / WhatsApp:</w:t>
+          </w:r>
+        </w:p>
+        <w:p>
+          <w:pPr>
+            <w:spacing w:before="0" w:after="0" w:line="240" w:lineRule="auto"/>
+          </w:pPr>
+          <w:hyperlink r:id="rId2">
+            <w:r>
+              <w:rPr>
+                <w:rFonts w:ascii="Segoe UI" w:hAnsi="Segoe UI" w:cs="Segoe UI"/>
+                <w:b/>
+                <w:color w:val="0F172A"/>
+                <w:sz w:val="19"/>
+                <w:u w:val="none"/>
+              </w:rPr>
+              <w:t>+91-7835019421</w:t>
+            </w:r>
+          </w:hyperlink>
+        </w:p>
+      </w:tc>
+      <w:tc>
+        <w:tcPr>
+          <w:tcW w:type="dxa" w:w="403"/>
+          <w:vAlign w:val="center"/>
+          <w:tcMar>
+            <w:left w:w="0" w:type="dxa"/>
+            <w:right w:w="40" w:type="dxa"/>
+            <w:top w:w="0" w:type="dxa"/>
+            <w:bottom w:w="0" w:type="dxa"/>
+          </w:tcMar>
+        </w:tcPr>
+        <w:p>
+          <w:pPr>
+            <w:spacing w:before="0" w:after="0" w:line="240" w:lineRule="auto"/>
+          </w:pPr>
+          <w:r>
+            <w:drawing>
+              <wp:inline xmlns:a="http://schemas.openxmlformats.org/drawingml/2006/main" xmlns:pic="http://schemas.openxmlformats.org/drawingml/2006/picture">
+                <wp:extent cx="219456" cy="219456"/>
+                <wp:docPr id="2" name="Picture 2"/>
+                <wp:cNvGraphicFramePr>
+                  <a:graphicFrameLocks noChangeAspect="1"/>
+                </wp:cNvGraphicFramePr>
+                <a:graphic>
+                  <a:graphicData uri="http://schemas.openxmlformats.org/drawingml/2006/picture">
+                    <pic:pic>
+                      <pic:nvPicPr>
+                        <pic:cNvPr id="0" name="crisp_mail.png"/>
+                        <pic:cNvPicPr/>
+                      </pic:nvPicPr>
+                      <pic:blipFill>
+                        <a:blip r:embed="rId3"/>
+                        <a:stretch>
+                          <a:fillRect/>
+                        </a:stretch>
+                      </pic:blipFill>
+                      <pic:spPr>
+                        <a:xfrm>
+                          <a:off x="0" y="0"/>
+                          <a:ext cx="219456" cy="219456"/>
+                        </a:xfrm>
+                        <a:prstGeom prst="rect"/>
+                      </pic:spPr>
+                    </pic:pic>
+                  </a:graphicData>
+                </a:graphic>
+              </wp:inline>
+            </w:drawing>
+          </w:r>
+        </w:p>
+      </w:tc>
+      <w:tc>
+        <w:tcPr>
+          <w:tcW w:type="dxa" w:w="3254"/>
+          <w:vAlign w:val="center"/>
+          <w:tcMar>
+            <w:left w:w="40" w:type="dxa"/>
+            <w:right w:w="60" w:type="dxa"/>
+            <w:top w:w="0" w:type="dxa"/>
+            <w:bottom w:w="0" w:type="dxa"/>
+          </w:tcMar>
+        </w:tcPr>
+        <w:p>
+          <w:pPr>
+            <w:spacing w:before="0" w:after="30" w:line="240" w:lineRule="auto"/>
+          </w:pPr>
+          <w:r>
+            <w:rPr>
+              <w:rFonts w:ascii="Segoe UI" w:hAnsi="Segoe UI"/>
+              <w:color w:val="64748B"/>
+              <w:sz w:val="15"/>
+            </w:rPr>
+            <w:t>Official Email:</w:t>
+          </w:r>
+        </w:p>
+        <w:p>
+          <w:pPr>
+            <w:spacing w:before="0" w:after="0" w:line="240" w:lineRule="auto"/>
+          </w:pPr>
+          <w:hyperlink r:id="rId4">
+            <w:r>
+              <w:rPr>
+                <w:rFonts w:ascii="Segoe UI" w:hAnsi="Segoe UI" w:cs="Segoe UI"/>
+                <w:b/>
+                <w:color w:val="0F172A"/>
+                <w:sz w:val="19"/>
+                <w:u w:val="none"/>
+              </w:rPr>
+              <w:t>contact@techminddevelopers.in</w:t>
+            </w:r>
+          </w:hyperlink>
+        </w:p>
+      </w:tc>
+      <w:tc>
+        <w:tcPr>
+          <w:tcW w:type="dxa" w:w="403"/>
+          <w:vAlign w:val="center"/>
+          <w:tcMar>
+            <w:left w:w="0" w:type="dxa"/>
+            <w:right w:w="40" w:type="dxa"/>
+            <w:top w:w="0" w:type="dxa"/>
+            <w:bottom w:w="0" w:type="dxa"/>
+          </w:tcMar>
+        </w:tcPr>
+        <w:p>
+          <w:pPr>
+            <w:spacing w:before="0" w:after="0" w:line="240" w:lineRule="auto"/>
+          </w:pPr>
+          <w:r>
+            <w:drawing>
+              <wp:inline xmlns:a="http://schemas.openxmlformats.org/drawingml/2006/main" xmlns:pic="http://schemas.openxmlformats.org/drawingml/2006/picture">
+                <wp:extent cx="219456" cy="219456"/>
+                <wp:docPr id="3" name="Picture 3"/>
+                <wp:cNvGraphicFramePr>
+                  <a:graphicFrameLocks noChangeAspect="1"/>
+                </wp:cNvGraphicFramePr>
+                <a:graphic>
+                  <a:graphicData uri="http://schemas.openxmlformats.org/drawingml/2006/picture">
+                    <pic:pic>
+                      <pic:nvPicPr>
+                        <pic:cNvPr id="0" name="crisp_web.png"/>
+                        <pic:cNvPicPr/>
+                      </pic:nvPicPr>
+                      <pic:blipFill>
+                        <a:blip r:embed="rId5"/>
+                        <a:stretch>
+                          <a:fillRect/>
+                        </a:stretch>
+                      </pic:blipFill>
+                      <pic:spPr>
+                        <a:xfrm>
+                          <a:off x="0" y="0"/>
+                          <a:ext cx="219456" cy="219456"/>
+                        </a:xfrm>
+                        <a:prstGeom prst="rect"/>
+                      </pic:spPr>
+                    </pic:pic>
+                  </a:graphicData>
+                </a:graphic>
+              </wp:inline>
+            </w:drawing>
+          </w:r>
+        </w:p>
+      </w:tc>
+      <w:tc>
+        <w:tcPr>
+          <w:tcW w:type="dxa" w:w="2966"/>
+          <w:vAlign w:val="center"/>
+          <w:tcMar>
+            <w:left w:w="40" w:type="dxa"/>
+            <w:right w:w="60" w:type="dxa"/>
+            <w:top w:w="0" w:type="dxa"/>
+            <w:bottom w:w="0" w:type="dxa"/>
+          </w:tcMar>
+        </w:tcPr>
+        <w:p>
+          <w:pPr>
+            <w:spacing w:before="0" w:after="30" w:line="240" w:lineRule="auto"/>
+          </w:pPr>
+          <w:r>
+            <w:rPr>
+              <w:rFonts w:ascii="Segoe UI" w:hAnsi="Segoe UI"/>
+              <w:color w:val="64748B"/>
+              <w:sz w:val="15"/>
+            </w:rPr>
+            <w:t>Official Website:</w:t>
+          </w:r>
+        </w:p>
+        <w:p>
+          <w:pPr>
+            <w:spacing w:before="0" w:after="0" w:line="240" w:lineRule="auto"/>
+          </w:pPr>
+          <w:hyperlink r:id="rId6">
+            <w:r>
+              <w:rPr>
+                <w:rFonts w:ascii="Segoe UI" w:hAnsi="Segoe UI" w:cs="Segoe UI"/>
+                <w:b/>
+                <w:color w:val="0F172A"/>
+                <w:sz w:val="19"/>
+                <w:u w:val="none"/>
+              </w:rPr>
+              <w:t>techminddevelopers.in</w:t>
+            </w:r>
+          </w:hyperlink>
+        </w:p>
+      </w:tc>
+    </w:tr>
+  </w:tbl>
   <w:p>
     <w:pPr>
-      <w:spacing w:after="40"/>
+      <w:spacing w:before="120" w:after="0" w:line="240" w:lineRule="auto"/>
       <w:jc w:val="center"/>
-      <w:rPr>
-        <w:color w:val="475569"/>
-        <w:sz w:val="17"/>
-      </w:rPr>
-    </w:pPr>
-  </w:p>
-  <w:p>
-    <w:pPr>
-      <w:spacing w:after="40"/>
-      <w:jc w:val="center"/>
-      <w:rPr>
-        <w:color w:val="475569"/>
-        <w:sz w:val="17"/>
-      </w:rPr>
-    </w:pPr>
-  </w:p>
-  <w:p>
-    <w:pPr>
-      <w:spacing w:after="40"/>
-      <w:jc w:val="center"/>
-      <w:rPr>
-        <w:color w:val="475569"/>
-        <w:sz w:val="17"/>
-      </w:rPr>
+      <w:pBdr>
+        <w:top w:val="single" w:sz="6" w:space="4" w:color="E2E8F0"/>
+      </w:pBdr>
     </w:pPr>
     <w:r>
       <w:rPr>
-        <w:rFonts w:ascii="Arial" w:hAnsi="Arial"/>
-        <w:noProof/>
-        <w:color w:val="2563EB"/>
-        <w:sz w:val="15"/>
-      </w:rPr>
-      <mc:AlternateContent>
-        <mc:Choice Requires="wps">
-          <w:drawing>
-            <wp:anchor distT="0" distB="0" distL="114300" distR="114300" simplePos="0" relativeHeight="251655680" behindDoc="0" locked="0" layoutInCell="1" allowOverlap="1" wp14:anchorId="05A0DB65" wp14:editId="0A09FF33">
-              <wp:simplePos x="0" y="0"/>
-              <wp:positionH relativeFrom="column">
-                <wp:posOffset>-514350</wp:posOffset>
-              </wp:positionH>
-              <wp:positionV relativeFrom="paragraph">
-                <wp:posOffset>133350</wp:posOffset>
-              </wp:positionV>
-              <wp:extent cx="7169150" cy="0"/>
-              <wp:effectExtent l="0" t="0" r="0" b="0"/>
-              <wp:wrapNone/>
-              <wp:docPr id="1163162424" name="Straight Connector 1"/>
-              <wp:cNvGraphicFramePr/>
-              <a:graphic xmlns:a="http://schemas.openxmlformats.org/drawingml/2006/main">
-                <a:graphicData uri="http://schemas.microsoft.com/office/word/2010/wordprocessingShape">
-                  <wps:wsp>
-                    <wps:cNvCnPr/>
-                    <wps:spPr>
-                      <a:xfrm>
-                        <a:off x="0" y="0"/>
-                        <a:ext cx="7169150" cy="0"/>
-                      </a:xfrm>
-                      <a:prstGeom prst="line">
-                        <a:avLst/>
-                      </a:prstGeom>
-                      <a:ln>
-                        <a:solidFill>
-                          <a:srgbClr val="2563EB"/>
-                        </a:solidFill>
-                      </a:ln>
-                    </wps:spPr>
-                    <wps:style>
-                      <a:lnRef idx="1">
-                        <a:schemeClr val="accent6"/>
-                      </a:lnRef>
-                      <a:fillRef idx="0">
-                        <a:schemeClr val="accent6"/>
-                      </a:fillRef>
-                      <a:effectRef idx="0">
-                        <a:schemeClr val="accent6"/>
-                      </a:effectRef>
-                      <a:fontRef idx="minor">
-                        <a:schemeClr val="tx1"/>
-                      </a:fontRef>
-                    </wps:style>
-                    <wps:bodyPr/>
-                  </wps:wsp>
-                </a:graphicData>
-              </a:graphic>
-              <wp14:sizeRelH relativeFrom="margin">
-                <wp14:pctWidth>0</wp14:pctWidth>
-              </wp14:sizeRelH>
-            </wp:anchor>
-          </w:drawing>
-        </mc:Choice>
-        <mc:Fallback>
-          <w:pict>
-            <v:line w14:anchorId="5BB317D7" id="Straight Connector 1" o:spid="_x0000_s1026" style="position:absolute;z-index:251655680;visibility:visible;mso-wrap-style:square;mso-width-percent:0;mso-wrap-distance-left:9pt;mso-wrap-distance-top:0;mso-wrap-distance-right:9pt;mso-wrap-distance-bottom:0;mso-position-horizontal:absolute;mso-position-horizontal-relative:text;mso-position-vertical:absolute;mso-position-vertical-relative:text;mso-width-percent:0;mso-width-relative:margin" from="-40.5pt,10.5pt" to="524pt,10.5pt" o:gfxdata="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" strokecolor="#2563eb"/>
-          </w:pict>
-        </mc:Fallback>
-      </mc:AlternateContent>
-    </w:r>
-  </w:p>
-  <w:p>
-    <w:pPr>
-      <w:spacing w:after="40"/>
-      <w:jc w:val="center"/>
-      <w:rPr>
-        <w:color w:val="475569"/>
-        <w:sz w:val="17"/>
-      </w:rPr>
-    </w:pPr>
-  </w:p>
-  <w:p>
-    <w:pPr>
-      <w:spacing w:after="40" w:before="40"/>
-      <w:jc w:val="center"/>
-    </w:pPr>
-    <w:r/>
-    <w:r>
-      <w:drawing>
-        <wp:inline xmlns:a="http://schemas.openxmlformats.org/drawingml/2006/main" xmlns:pic="http://schemas.openxmlformats.org/drawingml/2006/picture">
-          <wp:extent cx="6281928" cy="509513"/>
-          <wp:docPr id="1163162425" name="Picture 1163162425"/>
-          <wp:cNvGraphicFramePr>
-            <a:graphicFrameLocks noChangeAspect="1"/>
-          </wp:cNvGraphicFramePr>
-          <a:graphic>
-            <a:graphicData uri="http://schemas.openxmlformats.org/drawingml/2006/picture">
-              <pic:pic>
-                <pic:nvPicPr>
-                  <pic:cNvPr id="0" name="letterhead_footer_strip.png"/>
-                  <pic:cNvPicPr/>
-                </pic:nvPicPr>
-                <pic:blipFill>
-                  <a:blip r:embed="rId1"/>
-                  <a:stretch>
-                    <a:fillRect/>
-                  </a:stretch>
-                </pic:blipFill>
-                <pic:spPr>
-                  <a:xfrm>
-                    <a:off x="0" y="0"/>
-                    <a:ext cx="6281928" cy="509513"/>
-                  </a:xfrm>
-                  <a:prstGeom prst="rect"/>
-                </pic:spPr>
-              </pic:pic>
-            </a:graphicData>
-          </a:graphic>
-        </wp:inline>
-      </w:drawing>
-    </w:r>
-  </w:p>
-  <w:p>
-    <w:pPr>
-      <w:pStyle w:val="Footer"/>
-      <w:spacing w:before="20" w:after="0"/>
-      <w:jc w:val="center"/>
-    </w:pPr>
-    <w:r/>
-    <w:r>
-      <w:rPr>
-        <w:rFonts w:ascii="Arial" w:hAnsi="Arial"/>
+        <w:rFonts w:ascii="Segoe UI" w:hAnsi="Segoe UI"/>
         <w:color w:val="94A3B8"/>
-        <w:sz w:val="15"/>
-      </w:rPr>
-      <w:t>Offices: Delhi NCR (Okhla Industrial Area) &amp; Aligarh (UP)   •   Since 2014</w:t>
+        <w:sz w:val="14"/>
+      </w:rPr>
+      <w:t>Offices: Delhi NCR (Okhla Industrial Area) &amp; Aligarh (UP)   •   Since 2014   •   Confidential &amp; Proprietary</w:t>
     </w:r>
   </w:p>
 </w:ftr>

</xml_diff>